<commit_message>
Final CHi Test and Corrected
Complete rainfall.py: Fixed Chi-Square test, added full_analysis method
</commit_message>
<xml_diff>
--- a/hydrology_report_Ratu River Bridge.docx
+++ b/hydrology_report_Ratu River Bridge.docx
@@ -545,7 +545,7 @@
           </w:tcPr>
           <w:p>
             <w:r>
-              <w:t>N/A</w:t>
+              <w:t>2.0342</w:t>
             </w:r>
           </w:p>
         </w:tc>
@@ -555,7 +555,7 @@
           </w:tcPr>
           <w:p>
             <w:r>
-              <w:t>0.8680</w:t>
+              <w:t>1.0489</w:t>
             </w:r>
           </w:p>
         </w:tc>
@@ -597,7 +597,7 @@
           </w:tcPr>
           <w:p>
             <w:r>
-              <w:t>N/A</w:t>
+              <w:t>3.7054</w:t>
             </w:r>
           </w:p>
         </w:tc>
@@ -607,7 +607,7 @@
           </w:tcPr>
           <w:p>
             <w:r>
-              <w:t>0.4609</w:t>
+              <w:t>0.5393</w:t>
             </w:r>
           </w:p>
         </w:tc>
@@ -649,7 +649,7 @@
           </w:tcPr>
           <w:p>
             <w:r>
-              <w:t>N/A</w:t>
+              <w:t>18.3141</w:t>
             </w:r>
           </w:p>
         </w:tc>
@@ -659,7 +659,7 @@
           </w:tcPr>
           <w:p>
             <w:r>
-              <w:t>0.0762</w:t>
+              <w:t>0.0763</w:t>
             </w:r>
           </w:p>
         </w:tc>
@@ -701,7 +701,7 @@
           </w:tcPr>
           <w:p>
             <w:r>
-              <w:t>N/A</w:t>
+              <w:t>2.8816</w:t>
             </w:r>
           </w:p>
         </w:tc>
@@ -711,7 +711,7 @@
           </w:tcPr>
           <w:p>
             <w:r>
-              <w:t>0.7457</w:t>
+              <w:t>0.8641</w:t>
             </w:r>
           </w:p>
         </w:tc>
@@ -753,7 +753,7 @@
           </w:tcPr>
           <w:p>
             <w:r>
-              <w:t>N/A</w:t>
+              <w:t>1.3044</w:t>
             </w:r>
           </w:p>
         </w:tc>
@@ -763,7 +763,7 @@
           </w:tcPr>
           <w:p>
             <w:r>
-              <w:t>0.3529</w:t>
+              <w:t>0.6133</w:t>
             </w:r>
           </w:p>
         </w:tc>

</xml_diff>

<commit_message>
Initial commit: Complete Bridge Hydrology Agent v1.0"
Features:
- Catchment parameter calculation
- Rainfall frequency analysis (GEV, Gumbel, Normal, LP3, Laplace)
- IDF curve generation
- Peak discharge estimation (WECS, Dickens, Richards, Snyder, Rational)
- HEC-RAS integration (Excel-based parsing)
- Scour calculation (Lacey's, Blench's)
- Automated Word report generation
- Validated against Ratu Bridge Hydrology Report
</commit_message>
<xml_diff>
--- a/hydrology_report_Ratu River Bridge.docx
+++ b/hydrology_report_Ratu River Bridge.docx
@@ -2704,6 +2704,28 @@
           <w:p>
             <w:r>
               <w:t>629.53 m³/s</w:t>
+            </w:r>
+          </w:p>
+        </w:tc>
+      </w:tr>
+      <w:tr>
+        <w:tc>
+          <w:tcPr>
+            <w:tcW w:type="dxa" w:w="4320"/>
+          </w:tcPr>
+          <w:p>
+            <w:r>
+              <w:t>Rational Method</w:t>
+            </w:r>
+          </w:p>
+        </w:tc>
+        <w:tc>
+          <w:tcPr>
+            <w:tcW w:type="dxa" w:w="4320"/>
+          </w:tcPr>
+          <w:p>
+            <w:r>
+              <w:t>133.29 m³/s</w:t>
             </w:r>
           </w:p>
         </w:tc>

</xml_diff>